<commit_message>
feat: complete QAE assessment with API and mobile evidence
</commit_message>
<xml_diff>
--- a/docs/RELATORIO_TECNICO.docx
+++ b/docs/RELATORIO_TECNICO.docx
@@ -737,7 +737,7 @@
         <w:widowControl/>
       </w:pPr>
       <w:r>
-        <w:t>Evidência reportada na execução: 5 arquivos de testes aprovados; 12 testes aprovados; nenhuma falha; duração total 16,88 s; relatório JUnit gerado. O typecheck havia sido aprovado nas execuções anteriores e deve ser repetido no fechamento.</w:t>
+        <w:t>Na execução local consolidada da API, obtive 16 testes aprovados em 6 arquivos, sem falhas, com relatório JUnit gerado. A validação de tipos TypeScript também foi aprovada. Os resultados Mobile foram verificados separadamente.</w:t>
       </w:r>
     </w:p>
     <w:p>
@@ -754,7 +754,7 @@
         <w:widowControl/>
       </w:pPr>
       <w:r>
-        <w:t>Executei 12 testes de API com sucesso no ambiente local. Entretanto, não demonstrei cobertura integral de todos os requisitos do desafio. A validação efetiva do limite de 100 requisições por minuto continua pendente, assim como a execução da pipeline GitLab. Não apresento aprovação dos testes como equivalência a 100% de cobertura.</w:t>
+        <w:t>Executei 16 testes de API com sucesso no ambiente local. Entretanto, não demonstrei cobertura integral de todos os requisitos do desafio. O cenário API-015 utiliza um servidor local simulado e não comprova o limite real de 100 requisições por minuto da API ServeRest. A execução da pipeline GitLab também permanece pendente. Não apresento a aprovação dos testes como equivalência a 100% de cobertura.</w:t>
       </w:r>
     </w:p>
     <w:p>
@@ -866,7 +866,7 @@
         <w:widowControl/>
       </w:pPr>
       <w:r>
-        <w:t>Validei localmente os 12 testes de API e os 10 testes Android. Ainda preciso conferir o empacotamento final, a integridade dos artefatos e o procedimento de compartilhamento solicitado. A execução iOS, a execução GitLab CI e os requisitos não cobertos continuam declarados como limitações. Não afirmo ter executado funcionalidades ou plataformas sem evidências correspondentes.</w:t>
+        <w:t>Validei localmente 16 testes de API e 10 testes Android. Confirmei a integridade do arquivo ZIP com as evidências Mobile e o resumo Allure com dez aprovações. A execução iOS, a execução GitLab CI e os requisitos não cobertos permanecem declarados como limitações. Não afirmo ter executado funcionalidades ou plataformas sem evidências correspondentes.</w:t>
       </w:r>
     </w:p>
     <w:p>
@@ -1339,7 +1339,7 @@
         <w:pStyle w:val="ListBullet"/>
       </w:pPr>
       <w:r>
-        <w:t>Cobertura funcional: aprovação de 22 testes não equivale a cobertura integral.</w:t>
+        <w:t>Cobertura funcional: aprovação de 26 testes não equivale a cobertura integral dos requisitos.</w:t>
       </w:r>
     </w:p>
     <w:p>
@@ -1404,7 +1404,7 @@
     </w:p>
     <w:p>
       <w:r>
-        <w:t>Organizei 12 cenários de API em bdd/api.feature e 10 cenários Mobile em bdd/mobile.feature. Preservei as implementações automatizadas existentes: Vitest e Supertest para API; WebdriverIO, Mocha e Appium para Android.</w:t>
+        <w:t>Organizei 14 definições de cenários BDD de API em bdd/api.feature e 10 cenários Mobile em bdd/mobile.feature. Preservei as implementações automatizadas existentes: Vitest e Supertest para API; WebdriverIO, Mocha e Appium para Android.</w:t>
       </w:r>
     </w:p>
     <w:p>
@@ -2167,6 +2167,134 @@
           </w:p>
         </w:tc>
       </w:tr>
+      <w:tr>
+        <w:tc>
+          <w:tcPr>
+            <w:tcW w:type="dxa" w:w="2880"/>
+          </w:tcPr>
+          <w:p>
+            <w:r>
+              <w:t>API-013</w:t>
+            </w:r>
+          </w:p>
+        </w:tc>
+        <w:tc>
+          <w:tcPr>
+            <w:tcW w:type="dxa" w:w="2880"/>
+          </w:tcPr>
+          <w:p>
+            <w:r>
+              <w:t>Token válido em rota protegida</w:t>
+            </w:r>
+          </w:p>
+        </w:tc>
+        <w:tc>
+          <w:tcPr>
+            <w:tcW w:type="dxa" w:w="2880"/>
+          </w:tcPr>
+          <w:p>
+            <w:r>
+              <w:t>API — Vitest</w:t>
+            </w:r>
+          </w:p>
+        </w:tc>
+      </w:tr>
+      <w:tr>
+        <w:tc>
+          <w:tcPr>
+            <w:tcW w:type="dxa" w:w="2880"/>
+          </w:tcPr>
+          <w:p>
+            <w:r>
+              <w:t>API-014 (email)</w:t>
+            </w:r>
+          </w:p>
+        </w:tc>
+        <w:tc>
+          <w:tcPr>
+            <w:tcW w:type="dxa" w:w="2880"/>
+          </w:tcPr>
+          <w:p>
+            <w:r>
+              <w:t>Rejeitar cadastro sem e-mail</w:t>
+            </w:r>
+          </w:p>
+        </w:tc>
+        <w:tc>
+          <w:tcPr>
+            <w:tcW w:type="dxa" w:w="2880"/>
+          </w:tcPr>
+          <w:p>
+            <w:r>
+              <w:t>API — Vitest</w:t>
+            </w:r>
+          </w:p>
+        </w:tc>
+      </w:tr>
+      <w:tr>
+        <w:tc>
+          <w:tcPr>
+            <w:tcW w:type="dxa" w:w="2880"/>
+          </w:tcPr>
+          <w:p>
+            <w:r>
+              <w:t>API-014 (password)</w:t>
+            </w:r>
+          </w:p>
+        </w:tc>
+        <w:tc>
+          <w:tcPr>
+            <w:tcW w:type="dxa" w:w="2880"/>
+          </w:tcPr>
+          <w:p>
+            <w:r>
+              <w:t>Rejeitar cadastro sem senha</w:t>
+            </w:r>
+          </w:p>
+        </w:tc>
+        <w:tc>
+          <w:tcPr>
+            <w:tcW w:type="dxa" w:w="2880"/>
+          </w:tcPr>
+          <w:p>
+            <w:r>
+              <w:t>API — Vitest</w:t>
+            </w:r>
+          </w:p>
+        </w:tc>
+      </w:tr>
+      <w:tr>
+        <w:tc>
+          <w:tcPr>
+            <w:tcW w:type="dxa" w:w="2880"/>
+          </w:tcPr>
+          <w:p>
+            <w:r>
+              <w:t>API-015</w:t>
+            </w:r>
+          </w:p>
+        </w:tc>
+        <w:tc>
+          <w:tcPr>
+            <w:tcW w:type="dxa" w:w="2880"/>
+          </w:tcPr>
+          <w:p>
+            <w:r>
+              <w:t>Rate limiting simulado em servidor local</w:t>
+            </w:r>
+          </w:p>
+        </w:tc>
+        <w:tc>
+          <w:tcPr>
+            <w:tcW w:type="dxa" w:w="2880"/>
+          </w:tcPr>
+          <w:p>
+            <w:r>
+              <w:t>API — Vitest / Supertest</w:t>
+            </w:r>
+          </w:p>
+        </w:tc>
+      </w:tr>
     </w:tbl>
     <w:p>
       <w:pPr>
@@ -2183,7 +2311,53 @@
     </w:p>
     <w:p>
       <w:r>
-        <w:t>Reconheço que a documentação BDD não substitui a execução dos testes nem amplia automaticamente a cobertura funcional. Os resultados comprovados são 12 testes de API aprovados em execução local anterior e 10 testes Android aprovados em uma execução integrada. A execução iOS, a pipeline GitLab e os requisitos ainda não exercitados permanecem pendentes.</w:t>
+        <w:t>Reconheço que a documentação BDD não substitui a execução dos testes nem amplia automaticamente a cobertura funcional. Os resultados comprovados são 16 testes de API aprovados localmente e 10 testes Android aprovados em uma execução integrada. A execução iOS, a pipeline GitLab e os requisitos ainda não exercitados permanecem pendentes.</w:t>
+      </w:r>
+    </w:p>
+    <w:p>
+      <w:r>
+        <w:t>Atualização da suíte de API — 13/10/2026: executei os cinco arquivos de testes com sucesso, totalizando 15 verificações aprovadas em 20,23 segundos, sem falhas. O relatório JUnit foi gerado e a validação de tipos TypeScript foi concluída sem erros. Acrescentei a validação de token válido em recurso protegido e os casos de ausência de e-mail e senha. A verificação de rate limiting permanece pendente.</w:t>
+      </w:r>
+    </w:p>
+    <w:p>
+      <w:pPr>
+        <w:pStyle w:val="Heading1"/>
+      </w:pPr>
+      <w:r>
+        <w:t>13. API-015 — simulação de rate limiting</w:t>
+      </w:r>
+    </w:p>
+    <w:p>
+      <w:r>
+        <w:t>Implementei e executei um teste isolado com servidor HTTP local. O teste obteve 100 respostas HTTP 200 e confirmou HTTP 429 na requisição 101, incluindo o cabeçalho Retry-After. A execução foi aprovada em 13/10/2026. Essa simulação não comprova o rate limiting real da ServeRest nem a renovação de uma janela de 60 segundos.</w:t>
+      </w:r>
+    </w:p>
+    <w:p>
+      <w:pPr>
+        <w:pStyle w:val="Heading1"/>
+      </w:pPr>
+      <w:r>
+        <w:t>14. Resultado consolidado e evidências finais</w:t>
+      </w:r>
+    </w:p>
+    <w:p>
+      <w:r>
+        <w:t>Concluí a execução local da suíte API com 16 testes aprovados em seis arquivos, incluindo o teste API-015 de rate limiting simulado. A validação de tipos TypeScript também foi aprovada.</w:t>
+      </w:r>
+    </w:p>
+    <w:p>
+      <w:r>
+        <w:t>Executei novamente os dez cenários Android em uma única suíte, obtendo dez aprovações e nenhuma falha. Gerei o relatório HTML Allure a partir dessa execução, e validei o resumo: dez resultados aprovados, zero falhas, zero erros e zero ignorados.</w:t>
+      </w:r>
+    </w:p>
+    <w:p>
+      <w:r>
+        <w:t>O relatório Mobile foi compactado no arquivo entrega/evidencias/allure-mobile-android.zip. Conferi a integridade do ZIP e verifiquei que os valores sintéticos de e-mail e senha pesquisados não apareciam nos resultados atuais. Essa verificação não equivale a uma auditoria completa de informações sensíveis.</w:t>
+      </w:r>
+    </w:p>
+    <w:p>
+      <w:r>
+        <w:t>As configurações iOS e GitLab CI/CD foram preparadas, mas não executadas. Não afirmo ter validado essas plataformas ou a integração contínua em runners reais.</w:t>
       </w:r>
     </w:p>
     <w:sectPr>

</xml_diff>

<commit_message>
test: expand API coverage and consolidate 33 test results
</commit_message>
<xml_diff>
--- a/docs/RELATORIO_TECNICO.docx
+++ b/docs/RELATORIO_TECNICO.docx
@@ -737,7 +737,7 @@
         <w:widowControl/>
       </w:pPr>
       <w:r>
-        <w:t>Na execução local consolidada da API, obtive 16 testes aprovados em 6 arquivos, sem falhas, com relatório JUnit gerado. A validação de tipos TypeScript também foi aprovada. Os resultados Mobile foram verificados separadamente.</w:t>
+        <w:t>Na execução local consolidada da API, obtive 23 testes aprovados em 7 arquivos, sem falhas, com relatório JUnit gerado. A validação de tipos TypeScript também foi aprovada. Os resultados Mobile foram verificados separadamente.</w:t>
       </w:r>
     </w:p>
     <w:p>
@@ -754,7 +754,7 @@
         <w:widowControl/>
       </w:pPr>
       <w:r>
-        <w:t>Executei 16 testes de API com sucesso no ambiente local. Entretanto, não demonstrei cobertura integral de todos os requisitos do desafio. O cenário API-015 utiliza um servidor local simulado e não comprova o limite real de 100 requisições por minuto da API ServeRest. A execução da pipeline GitLab também permanece pendente. Não apresento a aprovação dos testes como equivalência a 100% de cobertura.</w:t>
+        <w:t>Executei 23 testes de API com sucesso no ambiente local. Entretanto, não demonstrei cobertura integral de todos os requisitos do desafio. O cenário API-015 utiliza o middleware Express Rate Limit em um servidor local controlado e não comprova o limite real de 100 requisições por minuto da API ServeRest. A execução da pipeline GitLab também permanece pendente. Não apresento a aprovação dos testes como equivalência a 100% de cobertura.</w:t>
       </w:r>
     </w:p>
     <w:p>
@@ -866,7 +866,7 @@
         <w:widowControl/>
       </w:pPr>
       <w:r>
-        <w:t>Validei localmente 16 testes de API e 10 testes Android. Confirmei a integridade do arquivo ZIP com as evidências Mobile e o resumo Allure com dez aprovações. A execução iOS, a execução GitLab CI e os requisitos não cobertos permanecem declarados como limitações. Não afirmo ter executado funcionalidades ou plataformas sem evidências correspondentes.</w:t>
+        <w:t>Validei localmente 23 testes de API e 10 testes Android. Confirmei a integridade do arquivo ZIP com as evidências Mobile e o resumo Allure com dez aprovações. A execução iOS, a execução GitLab CI e os requisitos não cobertos permanecem declarados como limitações. Não afirmo ter executado funcionalidades ou plataformas sem evidências correspondentes.</w:t>
       </w:r>
     </w:p>
     <w:p>
@@ -1339,7 +1339,7 @@
         <w:pStyle w:val="ListBullet"/>
       </w:pPr>
       <w:r>
-        <w:t>Cobertura funcional: aprovação de 26 testes não equivale a cobertura integral dos requisitos.</w:t>
+        <w:t>Cobertura funcional: aprovação de 33 testes não equivale a cobertura integral dos requisitos.</w:t>
       </w:r>
     </w:p>
     <w:p>
@@ -2280,7 +2280,7 @@
           </w:tcPr>
           <w:p>
             <w:r>
-              <w:t>Rate limiting simulado em servidor local</w:t>
+              <w:t>Rate limiting: bloquear a 101ª requisição e liberar novas requisições após a janela</w:t>
             </w:r>
           </w:p>
         </w:tc>
@@ -2290,7 +2290,199 @@
           </w:tcPr>
           <w:p>
             <w:r>
-              <w:t>API — Vitest / Supertest</w:t>
+              <w:t>2 testes Vitest + Express Rate Limit — ambiente local controlado — aprovados; não valida a ServeRest pública</w:t>
+            </w:r>
+          </w:p>
+        </w:tc>
+      </w:tr>
+      <w:tr>
+        <w:tc>
+          <w:tcPr>
+            <w:tcW w:type="dxa" w:w="2880"/>
+          </w:tcPr>
+          <w:p>
+            <w:r>
+              <w:t>API-016</w:t>
+            </w:r>
+          </w:p>
+        </w:tc>
+        <w:tc>
+          <w:tcPr>
+            <w:tcW w:type="dxa" w:w="2880"/>
+          </w:tcPr>
+          <w:p>
+            <w:r>
+              <w:t>Rejeitar cadastro com e-mail duplicado</w:t>
+            </w:r>
+          </w:p>
+        </w:tc>
+        <w:tc>
+          <w:tcPr>
+            <w:tcW w:type="dxa" w:w="2880"/>
+          </w:tcPr>
+          <w:p>
+            <w:r>
+              <w:t>Vitest + Supertest — API real — aprovado</w:t>
+            </w:r>
+          </w:p>
+        </w:tc>
+      </w:tr>
+      <w:tr>
+        <w:tc>
+          <w:tcPr>
+            <w:tcW w:type="dxa" w:w="2880"/>
+          </w:tcPr>
+          <w:p>
+            <w:r>
+              <w:t>API-017</w:t>
+            </w:r>
+          </w:p>
+        </w:tc>
+        <w:tc>
+          <w:tcPr>
+            <w:tcW w:type="dxa" w:w="2880"/>
+          </w:tcPr>
+          <w:p>
+            <w:r>
+              <w:t>Rejeitar cadastro sem administrador</w:t>
+            </w:r>
+          </w:p>
+        </w:tc>
+        <w:tc>
+          <w:tcPr>
+            <w:tcW w:type="dxa" w:w="2880"/>
+          </w:tcPr>
+          <w:p>
+            <w:r>
+              <w:t>Vitest + Supertest — API real — aprovado</w:t>
+            </w:r>
+          </w:p>
+        </w:tc>
+      </w:tr>
+      <w:tr>
+        <w:tc>
+          <w:tcPr>
+            <w:tcW w:type="dxa" w:w="2880"/>
+          </w:tcPr>
+          <w:p>
+            <w:r>
+              <w:t>API-018</w:t>
+            </w:r>
+          </w:p>
+        </w:tc>
+        <w:tc>
+          <w:tcPr>
+            <w:tcW w:type="dxa" w:w="2880"/>
+          </w:tcPr>
+          <w:p>
+            <w:r>
+              <w:t>Rejeitar acesso com token inválido</w:t>
+            </w:r>
+          </w:p>
+        </w:tc>
+        <w:tc>
+          <w:tcPr>
+            <w:tcW w:type="dxa" w:w="2880"/>
+          </w:tcPr>
+          <w:p>
+            <w:r>
+              <w:t>Vitest + Supertest — API real — aprovado</w:t>
+            </w:r>
+          </w:p>
+        </w:tc>
+      </w:tr>
+      <w:tr>
+        <w:tc>
+          <w:tcPr>
+            <w:tcW w:type="dxa" w:w="2880"/>
+          </w:tcPr>
+          <w:p>
+            <w:r>
+              <w:t>API-019</w:t>
+            </w:r>
+          </w:p>
+        </w:tc>
+        <w:tc>
+          <w:tcPr>
+            <w:tcW w:type="dxa" w:w="2880"/>
+          </w:tcPr>
+          <w:p>
+            <w:r>
+              <w:t>Rejeitar login sem e-mail</w:t>
+            </w:r>
+          </w:p>
+        </w:tc>
+        <w:tc>
+          <w:tcPr>
+            <w:tcW w:type="dxa" w:w="2880"/>
+          </w:tcPr>
+          <w:p>
+            <w:r>
+              <w:t>Vitest + Supertest — API real — aprovado</w:t>
+            </w:r>
+          </w:p>
+        </w:tc>
+      </w:tr>
+      <w:tr>
+        <w:tc>
+          <w:tcPr>
+            <w:tcW w:type="dxa" w:w="2880"/>
+          </w:tcPr>
+          <w:p>
+            <w:r>
+              <w:t>API-020</w:t>
+            </w:r>
+          </w:p>
+        </w:tc>
+        <w:tc>
+          <w:tcPr>
+            <w:tcW w:type="dxa" w:w="2880"/>
+          </w:tcPr>
+          <w:p>
+            <w:r>
+              <w:t>Rejeitar login sem senha</w:t>
+            </w:r>
+          </w:p>
+        </w:tc>
+        <w:tc>
+          <w:tcPr>
+            <w:tcW w:type="dxa" w:w="2880"/>
+          </w:tcPr>
+          <w:p>
+            <w:r>
+              <w:t>Vitest + Supertest — API real — aprovado</w:t>
+            </w:r>
+          </w:p>
+        </w:tc>
+      </w:tr>
+      <w:tr>
+        <w:tc>
+          <w:tcPr>
+            <w:tcW w:type="dxa" w:w="2880"/>
+          </w:tcPr>
+          <w:p>
+            <w:r>
+              <w:t>API-021</w:t>
+            </w:r>
+          </w:p>
+        </w:tc>
+        <w:tc>
+          <w:tcPr>
+            <w:tcW w:type="dxa" w:w="2880"/>
+          </w:tcPr>
+          <w:p>
+            <w:r>
+              <w:t>Tratar exclusão de usuário inexistente</w:t>
+            </w:r>
+          </w:p>
+        </w:tc>
+        <w:tc>
+          <w:tcPr>
+            <w:tcW w:type="dxa" w:w="2880"/>
+          </w:tcPr>
+          <w:p>
+            <w:r>
+              <w:t>Vitest + Supertest — API real — aprovado</w:t>
             </w:r>
           </w:p>
         </w:tc>
@@ -2311,7 +2503,7 @@
     </w:p>
     <w:p>
       <w:r>
-        <w:t>Reconheço que a documentação BDD não substitui a execução dos testes nem amplia automaticamente a cobertura funcional. Os resultados comprovados são 16 testes de API aprovados localmente e 10 testes Android aprovados em uma execução integrada. A execução iOS, a pipeline GitLab e os requisitos ainda não exercitados permanecem pendentes.</w:t>
+        <w:t>Reconheço que a documentação BDD não substitui a execução dos testes nem amplia automaticamente a cobertura funcional. Os resultados comprovados são 23 testes de API aprovados localmente e 10 testes Android aprovados em uma execução integrada. A execução iOS, a pipeline GitLab e os requisitos ainda não exercitados permanecem pendentes.</w:t>
       </w:r>
     </w:p>
     <w:p>
@@ -2342,7 +2534,7 @@
     </w:p>
     <w:p>
       <w:r>
-        <w:t>Concluí a execução local da suíte API com 16 testes aprovados em seis arquivos, incluindo o teste API-015 de rate limiting simulado. A validação de tipos TypeScript também foi aprovada.</w:t>
+        <w:t>Concluí a execução local da suíte API com 23 testes aprovados em sete arquivos, incluindo dois testes API-015 com Express Rate Limit em ambiente local controlado. A validação de tipos TypeScript também foi aprovada.</w:t>
       </w:r>
     </w:p>
     <w:p>
@@ -2358,6 +2550,39 @@
     <w:p>
       <w:r>
         <w:t>As configurações iOS e GitLab CI/CD foram preparadas, mas não executadas. Não afirmo ter validado essas plataformas ou a integração contínua em runners reais.</w:t>
+      </w:r>
+    </w:p>
+    <w:p>
+      <w:pPr>
+        <w:pStyle w:val="Heading1"/>
+      </w:pPr>
+      <w:r>
+        <w:t>15. Ampliação da cobertura de API e análise de qualidade</w:t>
+      </w:r>
+    </w:p>
+    <w:p>
+      <w:r>
+        <w:t>Ampliei a suíte para 23 testes de API, executados com sucesso em sete arquivos. Somados aos dez cenários Android aprovados, totalizei 33 testes automatizados.</w:t>
+      </w:r>
+    </w:p>
+    <w:p>
+      <w:r>
+        <w:t>Acrescentei os cenários API-016 a API-021, cobrindo duplicidade de e-mail, ausência do campo administrador, token inválido, campos obrigatórios do login e exclusão de usuário inexistente.</w:t>
+      </w:r>
+    </w:p>
+    <w:p>
+      <w:r>
+        <w:t>No API-015, utilizei o middleware Express Rate Limit para testar o bloqueio da requisição 101 e a recuperação após o término de uma janela controlada. Esses testes não comprovam rate limiting na ServeRest pública.</w:t>
+      </w:r>
+    </w:p>
+    <w:p>
+      <w:r>
+        <w:t>Durante a validação de contrato da listagem, observei que um entre 149 registros públicos retornados continha um e-mail rejeitado pelo formato exigido pelo Zod. Separei a verificação estrutural da listagem da validação rigorosa dos dados sintéticos que controlo. Registrei o achado como observação, não como defeito confirmado.</w:t>
+      </w:r>
+    </w:p>
+    <w:p>
+      <w:r>
+        <w:t>A execução iOS e a execução efetiva da pipeline GitLab permanecem pendentes. Não considero a aprovação dos testes equivalente a 100% de cobertura dos requisitos.</w:t>
       </w:r>
     </w:p>
     <w:sectPr>

</xml_diff>

<commit_message>
docs: record successful GitLab API pipeline
</commit_message>
<xml_diff>
--- a/docs/RELATORIO_TECNICO.docx
+++ b/docs/RELATORIO_TECNICO.docx
@@ -2585,6 +2585,34 @@
         <w:t>A execução iOS e a execução efetiva da pipeline GitLab permanecem pendentes. Não considero a aprovação dos testes equivalente a 100% de cobertura dos requisitos.</w:t>
       </w:r>
     </w:p>
+    <w:p>
+      <w:pPr>
+        <w:pStyle w:val="Heading1"/>
+      </w:pPr>
+      <w:r>
+        <w:t>16. Evidência de execução GitLab CI/CD</w:t>
+      </w:r>
+    </w:p>
+    <w:p>
+      <w:r>
+        <w:t>Executei a pipeline #2944807970 no GitLab, na branch main, utilizando um runner Linux. O job api_tests (#17157098608) foi concluído com sucesso, com 23 testes de API aprovados em sete arquivos, sem falhas.</w:t>
+      </w:r>
+    </w:p>
+    <w:p>
+      <w:r>
+        <w:t>A execução realizou instalação reproduzível de dependências com npm ci, validação de tipos com npm run typecheck e execução automatizada com npm test. O relatório JUnit foi publicado como artefato do GitLab.</w:t>
+      </w:r>
+    </w:p>
+    <w:p>
+      <w:r>
+        <w:t>A execução Android foi validada separadamente em ambiente local, com dez testes aprovados e relatório Allure. Os jobs Mobile do GitLab não foram executados porque dependem de runners especializados. A execução iOS também permanece não realizada.</w:t>
+      </w:r>
+    </w:p>
+    <w:p>
+      <w:r>
+        <w:t>O rate limiting foi exercitado em ambiente local controlado utilizando Express Rate Limit; não foi comprovado na API ServeRest pública.</w:t>
+      </w:r>
+    </w:p>
     <w:sectPr>
       <w:headerReference w:type="default" r:id="rId9"/>
       <w:footerReference w:type="default" r:id="rId10"/>

</xml_diff>

<commit_message>
docs: document successful API and Android CI execution
</commit_message>
<xml_diff>
--- a/docs/RELATORIO_TECNICO.docx
+++ b/docs/RELATORIO_TECNICO.docx
@@ -30,7 +30,7 @@
     </w:p>
     <w:p>
       <w:r>
-        <w:t>Implementei duas suítes de automação independentes, uma para API REST e outra para aplicativo Mobile Android. Executei e validei localmente 23 testes de API e dez testes Android. Além disso, comprovei a execução automatizada dos 23 testes de API em um runner GitLab, com validação TypeScript e publicação do relatório JUnit.</w:t>
+        <w:t>Implementei duas suítes independentes de automação, uma para API REST e outra para aplicativo Mobile Android. Validei 23 testes de API e 10 testes Android localmente e em integração contínua. No GitHub Actions, os dois jobs foram aprovados, com publicação dos relatórios JUnit e Allure. Também executei a suíte de API no GitLab CI/CD.</w:t>
       </w:r>
     </w:p>
     <w:tbl>
@@ -296,6 +296,28 @@
           </w:p>
         </w:tc>
       </w:tr>
+      <w:tr>
+        <w:tc>
+          <w:tcPr>
+            <w:tcW w:type="dxa" w:w="5011"/>
+          </w:tcPr>
+          <w:p>
+            <w:r>
+              <w:t>API + Android — GitHub Actions</w:t>
+            </w:r>
+          </w:p>
+        </w:tc>
+        <w:tc>
+          <w:tcPr>
+            <w:tcW w:type="dxa" w:w="5011"/>
+          </w:tcPr>
+          <w:p>
+            <w:r>
+              <w:t>23/23 API e 10/10 Android aprovados; JUnit e Allure</w:t>
+            </w:r>
+          </w:p>
+        </w:tc>
+      </w:tr>
     </w:tbl>
     <w:p>
       <w:r>
@@ -312,7 +334,7 @@
     </w:p>
     <w:p>
       <w:r>
-        <w:t>Estruturei o repositório em api-tests, mobile-tests, bdd e docs. Para a API, utilizei TypeScript, Vitest, Supertest, Zod, clientes HTTP separados, fábrica de dados sintéticos e scripts de typecheck. Para Mobile, utilizei WebdriverIO, Appium, UiAutomator2, Mocha, Page Object Model e Allure. O GitLab CI/CD executa automaticamente a qualidade da API.</w:t>
+        <w:t>Estruturei o repositório em api-tests, mobile-tests, bdd e docs. Para API, utilizei TypeScript, Vitest, Supertest e Zod, com clientes HTTP reutilizáveis e geração de dados sintéticos. Para Mobile, utilizei WebdriverIO, Appium, UiAutomator2, Mocha, Page Object Model e Allure. Configurei GitHub Actions para automatizar a execução das duas suítes, mantendo também a pipeline de API no GitLab.</w:t>
       </w:r>
     </w:p>
     <w:p>
@@ -1620,7 +1642,7 @@
     </w:tbl>
     <w:p>
       <w:r>
-        <w:t>Concluí a execução dos 23 testes da suíte de API no ambiente local e na pipeline GitLab. Os dois testes do grupo API-015 validam o middleware Express Rate Limit no servidor local controlado.</w:t>
+        <w:t>Concluí a execução dos 23 testes da suíte de API localmente e em CI/CD. Também validei os 10 testes Android no GitHub Actions. Os dois testes do grupo API-015 exercitam o middleware Express Rate Limit em ambiente local controlado.</w:t>
       </w:r>
     </w:p>
     <w:p>
@@ -2080,17 +2102,17 @@
         <w:pStyle w:val="Heading1"/>
       </w:pPr>
       <w:r>
-        <w:t>6. GitLab CI/CD — execução automatizada de API</w:t>
+        <w:t>6. Integração contínua — GitHub Actions e GitLab</w:t>
       </w:r>
     </w:p>
     <w:p>
       <w:r>
-        <w:t>Publiquei o projeto no repositório público gitlab.com/fernando-damasio-group/carrefour-qae-automation. Executei a pipeline #2944807970 na branch main. O job api_tests (#17157098608) concluiu com sucesso em runner Linux, utilizando npm ci, npm run typecheck e npm test; os 23 testes foram aprovados e o JUnit foi disponibilizado como artefato. Pipelines posteriores também foram aprovadas.</w:t>
+        <w:t>Configurei a execução automatizada dos testes no GitHub Actions. O workflow aprovou 23 testes de API e 10 testes Android, executados em runner Linux com emulador provisionado na pipeline. Publiquei JUnit e Allure como artefatos. Também mantive a integração GitLab CI/CD para API, com pipeline #2944807970 aprovada.</w:t>
       </w:r>
     </w:p>
     <w:p>
       <w:r>
-        <w:t>A configuração CI/CD contém o job automatizado da API e jobs Mobile preparados para runners especializados. Os dez testes Android foram executados localmente, com evidências Allure; não houve execução Android em runner GitLab.</w:t>
+        <w:t>O GitHub Actions executa a suíte de API e a suíte Android, utilizando Node.js, Java, Appium e WebdriverIO. O ambiente Android é preparado durante a execução, sem dependência do emulador local. O GitLab permanece configurado para a suíte de API.</w:t>
       </w:r>
     </w:p>
     <w:p>
@@ -2157,12 +2179,12 @@
     </w:p>
     <w:p>
       <w:r>
-        <w:t>Entreguei 23 testes de API aprovados, dez testes Android aprovados, documentação BDD, relatórios JUnit e Allure e integração contínua de API executada em runner GitLab. Os relatórios registram as ferramentas, as evidências e o escopo das verificações realizadas.</w:t>
+        <w:t>Implementei e validei 23 testes de API e 10 testes Android, totalizando 33 testes automatizados aprovados. Organizei a solução com Page Object Model, clientes HTTP reutilizáveis, schemas Zod, especificações BDD, relatórios JUnit e Allure e integração contínua para as duas suítes no GitHub Actions.</w:t>
       </w:r>
     </w:p>
     <w:p>
       <w:r>
-        <w:t>As evidências de Android correspondem à execução local; a integração CI do projeto foi executada e comprovada para a suíte de API.</w:t>
+        <w:t>A execução de referência no GitHub Actions aprovou as suítes de API e Android, com relatórios disponíveis como artefatos. Evidência: https://github.com/FernandoDamasioAlves/carrefour-qae-automation/actions/runs/38601257714</w:t>
       </w:r>
     </w:p>
     <w:sectPr>

</xml_diff>